<commit_message>
Sync remaining stage1 path references and regenerate report formats
Follow-up to the stage-folder reorg: stage2 security-review/network-design
and stage3 asset-inventory now point at stage1 src/ + outputs/ + docs/;
Stage1 completion report rebuilt at its new location (md/docx/html).

🤖 Generated with Codebuff
Co-Authored-By: Codebuff <noreply@codebuff.com>
</commit_message>
<xml_diff>
--- a/stage1-network-traffic-analyzer/SecureBank-Stage1-Completion-Report.docx
+++ b/stage1-network-traffic-analyzer/SecureBank-Stage1-Completion-Report.docx
@@ -1461,7 +1461,7 @@
           <w:rFonts w:ascii="Consolas" w:hAnsi="Consolas"/>
           <w:shd w:val="clear" w:fill="F2F2F2"/>
         </w:rPr>
-        <w:t xml:space="preserve">Project/outputs/validate_report.py</w:t>
+        <w:t xml:space="preserve">src/validate_report.py</w:t>
       </w:r>
     </w:p>
     <w:p>
@@ -2488,7 +2488,7 @@
           <w:rFonts w:ascii="Consolas" w:hAnsi="Consolas"/>
           <w:shd w:val="clear" w:fill="F2F2F2"/>
         </w:rPr>
-        <w:t xml:space="preserve">Project/outputs/validate_report.py</w:t>
+        <w:t xml:space="preserve">src/validate_report.py</w:t>
       </w:r>
       <w:r>
         <w:t xml:space="preserve"> is the Stage 7</w:t>
@@ -2694,7 +2694,7 @@
                 <w:rFonts w:ascii="Consolas" w:hAnsi="Consolas"/>
                 <w:shd w:val="clear" w:fill="F2F2F2"/>
               </w:rPr>
-              <w:t xml:space="preserve">Project/outputs/network_traffic_analyzer.py</w:t>
+              <w:t xml:space="preserve">src/network_traffic_analyzer.py</w:t>
             </w:r>
           </w:p>
         </w:tc>
@@ -2736,7 +2736,7 @@
                 <w:rFonts w:ascii="Consolas" w:hAnsi="Consolas"/>
                 <w:shd w:val="clear" w:fill="F2F2F2"/>
               </w:rPr>
-              <w:t xml:space="preserve">Project/outputs/detections.py</w:t>
+              <w:t xml:space="preserve">src/detections.py</w:t>
             </w:r>
           </w:p>
         </w:tc>
@@ -2768,7 +2768,7 @@
                 <w:rFonts w:ascii="Consolas" w:hAnsi="Consolas"/>
                 <w:shd w:val="clear" w:fill="F2F2F2"/>
               </w:rPr>
-              <w:t xml:space="preserve">Project/outputs/README.md</w:t>
+              <w:t xml:space="preserve">docs/usage.md</w:t>
             </w:r>
           </w:p>
         </w:tc>
@@ -2800,7 +2800,7 @@
                 <w:rFonts w:ascii="Consolas" w:hAnsi="Consolas"/>
                 <w:shd w:val="clear" w:fill="F2F2F2"/>
               </w:rPr>
-              <w:t xml:space="preserve">Project/outputs/CODE_EXPLANATION.md</w:t>
+              <w:t xml:space="preserve">docs/CODE_EXPLANATION.md</w:t>
             </w:r>
           </w:p>
         </w:tc>
@@ -2956,7 +2956,7 @@
         <w:shd w:val="clear" w:fill="F5F5F5"/>
       </w:pPr>
       <w:r>
-        <w:t xml:space="preserve">sudo python3 Project/outputs/network_traffic_analyzer.py --interface eth0 --timeout 60</w:t>
+        <w:t xml:space="preserve">sudo python3 src/network_traffic_analyzer.py --interface eth0 --timeout 60</w:t>
       </w:r>
     </w:p>
     <w:p>
@@ -2983,7 +2983,7 @@
         <w:shd w:val="clear" w:fill="F5F5F5"/>
       </w:pPr>
       <w:r>
-        <w:t xml:space="preserve">python3 Project/outputs/network_traffic_analyzer.py --read-pcap incident.pcap --json-out report.json</w:t>
+        <w:t xml:space="preserve">python3 src/network_traffic_analyzer.py --read-pcap incident.pcap --json-out report.json</w:t>
       </w:r>
     </w:p>
     <w:p>
@@ -3010,7 +3010,7 @@
         <w:shd w:val="clear" w:fill="F5F5F5"/>
       </w:pPr>
       <w:r>
-        <w:t xml:space="preserve">python3 Project/outputs/network_traffic_analyzer.py --interface eth0 --timeout 60 --json-only</w:t>
+        <w:t xml:space="preserve">python3 src/network_traffic_analyzer.py --interface eth0 --timeout 60 --json-only</w:t>
       </w:r>
     </w:p>
     <w:p>

</xml_diff>